<commit_message>
Fixed age buckets (feedback Astrid)
</commit_message>
<xml_diff>
--- a/World Cafe Facilitation Guide/Informed Consent Form.docx
+++ b/World Cafe Facilitation Guide/Informed Consent Form.docx
@@ -1,6 +1,6 @@
 
 <file path=word/document.xml><?xml version="1.0" encoding="utf-8"?>
-<w:document xmlns:wpc="http://schemas.microsoft.com/office/word/2010/wordprocessingCanvas" xmlns:cx="http://schemas.microsoft.com/office/drawing/2014/chartex" xmlns:cx1="http://schemas.microsoft.com/office/drawing/2015/9/8/chartex" xmlns:cx2="http://schemas.microsoft.com/office/drawing/2015/10/21/chartex" xmlns:cx3="http://schemas.microsoft.com/office/drawing/2016/5/9/chartex" xmlns:cx4="http://schemas.microsoft.com/office/drawing/2016/5/10/chartex" xmlns:cx5="http://schemas.microsoft.com/office/drawing/2016/5/11/chartex" xmlns:cx6="http://schemas.microsoft.com/office/drawing/2016/5/12/chartex" xmlns:cx7="http://schemas.microsoft.com/office/drawing/2016/5/13/chartex" xmlns:cx8="http://schemas.microsoft.com/office/drawing/2016/5/14/chartex" xmlns:mc="http://schemas.openxmlformats.org/markup-compatibility/2006" xmlns:aink="http://schemas.microsoft.com/office/drawing/2016/ink" xmlns:am3d="http://schemas.microsoft.com/office/drawing/2017/model3d" xmlns:o="urn:schemas-microsoft-com:office:office" xmlns:oel="http://schemas.microsoft.com/office/2019/extlst" xmlns:r="http://schemas.openxmlformats.org/officeDocument/2006/relationships" xmlns:m="http://schemas.openxmlformats.org/officeDocument/2006/math" xmlns:v="urn:schemas-microsoft-com:vml" xmlns:wp14="http://schemas.microsoft.com/office/word/2010/wordprocessingDrawing" xmlns:wp="http://schemas.openxmlformats.org/drawingml/2006/wordprocessingDrawing" xmlns:w10="urn:schemas-microsoft-com:office:word" xmlns:w="http://schemas.openxmlformats.org/wordprocessingml/2006/main" xmlns:w14="http://schemas.microsoft.com/office/word/2010/wordml" xmlns:w15="http://schemas.microsoft.com/office/word/2012/wordml" xmlns:w16cei="http://schemas.microsoft.com/office/word/2026/wordml/cei" xmlns:w16cex="http://schemas.microsoft.com/office/word/2018/wordml/cex" xmlns:w16cid="http://schemas.microsoft.com/office/word/2016/wordml/cid" xmlns:w16="http://schemas.microsoft.com/office/word/2018/wordml" xmlns:w16du="http://schemas.microsoft.com/office/word/2023/wordml/word16du" xmlns:w16sdtdh="http://schemas.microsoft.com/office/word/2020/wordml/sdtdatahash" xmlns:w16sdtfl="http://schemas.microsoft.com/office/word/2024/wordml/sdtformatlock" xmlns:w16se="http://schemas.microsoft.com/office/word/2015/wordml/symex" xmlns:wpg="http://schemas.microsoft.com/office/word/2010/wordprocessingGroup" xmlns:wpi="http://schemas.microsoft.com/office/word/2010/wordprocessingInk" xmlns:wne="http://schemas.microsoft.com/office/word/2006/wordml" xmlns:wps="http://schemas.microsoft.com/office/word/2010/wordprocessingShape" mc:Ignorable="w14 w15 w16se w16cid w16 w16cex w16sdtdh w16sdtfl w16du wp14">
+<w:document xmlns:wpc="http://schemas.microsoft.com/office/word/2010/wordprocessingCanvas" xmlns:cx="http://schemas.microsoft.com/office/drawing/2014/chartex" xmlns:cx1="http://schemas.microsoft.com/office/drawing/2015/9/8/chartex" xmlns:cx2="http://schemas.microsoft.com/office/drawing/2015/10/21/chartex" xmlns:cx3="http://schemas.microsoft.com/office/drawing/2016/5/9/chartex" xmlns:cx4="http://schemas.microsoft.com/office/drawing/2016/5/10/chartex" xmlns:cx5="http://schemas.microsoft.com/office/drawing/2016/5/11/chartex" xmlns:cx6="http://schemas.microsoft.com/office/drawing/2016/5/12/chartex" xmlns:cx7="http://schemas.microsoft.com/office/drawing/2016/5/13/chartex" xmlns:cx8="http://schemas.microsoft.com/office/drawing/2016/5/14/chartex" xmlns:mc="http://schemas.openxmlformats.org/markup-compatibility/2006" xmlns:aink="http://schemas.microsoft.com/office/drawing/2016/ink" xmlns:am3d="http://schemas.microsoft.com/office/drawing/2017/model3d" xmlns:o="urn:schemas-microsoft-com:office:office" xmlns:oel="http://schemas.microsoft.com/office/2019/extlst" xmlns:r="http://schemas.openxmlformats.org/officeDocument/2006/relationships" xmlns:m="http://schemas.openxmlformats.org/officeDocument/2006/math" xmlns:v="urn:schemas-microsoft-com:vml" xmlns:wp14="http://schemas.microsoft.com/office/word/2010/wordprocessingDrawing" xmlns:wp="http://schemas.openxmlformats.org/drawingml/2006/wordprocessingDrawing" xmlns:w10="urn:schemas-microsoft-com:office:word" xmlns:w="http://schemas.openxmlformats.org/wordprocessingml/2006/main" xmlns:w14="http://schemas.microsoft.com/office/word/2010/wordml" xmlns:w15="http://schemas.microsoft.com/office/word/2012/wordml" xmlns:w16cex="http://schemas.microsoft.com/office/word/2018/wordml/cex" xmlns:w16cid="http://schemas.microsoft.com/office/word/2016/wordml/cid" xmlns:w16="http://schemas.microsoft.com/office/word/2018/wordml" xmlns:w16du="http://schemas.microsoft.com/office/word/2023/wordml/word16du" xmlns:w16sdtdh="http://schemas.microsoft.com/office/word/2020/wordml/sdtdatahash" xmlns:w16sdtfl="http://schemas.microsoft.com/office/word/2024/wordml/sdtformatlock" xmlns:w16se="http://schemas.microsoft.com/office/word/2015/wordml/symex" xmlns:wpg="http://schemas.microsoft.com/office/word/2010/wordprocessingGroup" xmlns:wpi="http://schemas.microsoft.com/office/word/2010/wordprocessingInk" xmlns:wne="http://schemas.microsoft.com/office/word/2006/wordml" xmlns:wps="http://schemas.microsoft.com/office/word/2010/wordprocessingShape" mc:Ignorable="w14 w15 w16se w16cid w16 w16cex w16sdtdh w16sdtfl w16du wp14">
   <w:body>
     <w:p>
       <w:pPr>
@@ -1484,7 +1484,19 @@
               <w:rPr>
                 <w:lang w:val="en-US"/>
               </w:rPr>
-              <w:t xml:space="preserve">26-36 </w:t>
+              <w:t>26-3</w:t>
+            </w:r>
+            <w:r>
+              <w:rPr>
+                <w:lang w:val="en-US"/>
+              </w:rPr>
+              <w:t>5</w:t>
+            </w:r>
+            <w:r>
+              <w:rPr>
+                <w:lang w:val="en-US"/>
+              </w:rPr>
+              <w:t xml:space="preserve"> </w:t>
             </w:r>
             <w:r>
               <w:rPr>
@@ -1506,7 +1518,19 @@
               <w:rPr>
                 <w:lang w:val="en-US"/>
               </w:rPr>
-              <w:t xml:space="preserve"> 36-46 </w:t>
+              <w:t xml:space="preserve"> 36-4</w:t>
+            </w:r>
+            <w:r>
+              <w:rPr>
+                <w:lang w:val="en-US"/>
+              </w:rPr>
+              <w:t>5</w:t>
+            </w:r>
+            <w:r>
+              <w:rPr>
+                <w:lang w:val="en-US"/>
+              </w:rPr>
+              <w:t xml:space="preserve"> </w:t>
             </w:r>
             <w:r>
               <w:rPr>
@@ -1536,7 +1560,31 @@
               <w:rPr>
                 <w:lang w:val="en-US"/>
               </w:rPr>
-              <w:t xml:space="preserve">46-56 </w:t>
+              <w:t>4</w:t>
+            </w:r>
+            <w:r>
+              <w:rPr>
+                <w:lang w:val="en-US"/>
+              </w:rPr>
+              <w:t>6</w:t>
+            </w:r>
+            <w:r>
+              <w:rPr>
+                <w:lang w:val="en-US"/>
+              </w:rPr>
+              <w:t>-5</w:t>
+            </w:r>
+            <w:r>
+              <w:rPr>
+                <w:lang w:val="en-US"/>
+              </w:rPr>
+              <w:t>5</w:t>
+            </w:r>
+            <w:r>
+              <w:rPr>
+                <w:lang w:val="en-US"/>
+              </w:rPr>
+              <w:t xml:space="preserve"> </w:t>
             </w:r>
             <w:r>
               <w:rPr>
@@ -1954,7 +2002,7 @@
 </file>
 
 <file path=word/endnotes.xml><?xml version="1.0" encoding="utf-8"?>
-<w:endnotes xmlns:wpc="http://schemas.microsoft.com/office/word/2010/wordprocessingCanvas" xmlns:cx="http://schemas.microsoft.com/office/drawing/2014/chartex" xmlns:cx1="http://schemas.microsoft.com/office/drawing/2015/9/8/chartex" xmlns:cx2="http://schemas.microsoft.com/office/drawing/2015/10/21/chartex" xmlns:cx3="http://schemas.microsoft.com/office/drawing/2016/5/9/chartex" xmlns:cx4="http://schemas.microsoft.com/office/drawing/2016/5/10/chartex" xmlns:cx5="http://schemas.microsoft.com/office/drawing/2016/5/11/chartex" xmlns:cx6="http://schemas.microsoft.com/office/drawing/2016/5/12/chartex" xmlns:cx7="http://schemas.microsoft.com/office/drawing/2016/5/13/chartex" xmlns:cx8="http://schemas.microsoft.com/office/drawing/2016/5/14/chartex" xmlns:mc="http://schemas.openxmlformats.org/markup-compatibility/2006" xmlns:aink="http://schemas.microsoft.com/office/drawing/2016/ink" xmlns:am3d="http://schemas.microsoft.com/office/drawing/2017/model3d" xmlns:o="urn:schemas-microsoft-com:office:office" xmlns:oel="http://schemas.microsoft.com/office/2019/extlst" xmlns:r="http://schemas.openxmlformats.org/officeDocument/2006/relationships" xmlns:m="http://schemas.openxmlformats.org/officeDocument/2006/math" xmlns:v="urn:schemas-microsoft-com:vml" xmlns:wp14="http://schemas.microsoft.com/office/word/2010/wordprocessingDrawing" xmlns:wp="http://schemas.openxmlformats.org/drawingml/2006/wordprocessingDrawing" xmlns:w10="urn:schemas-microsoft-com:office:word" xmlns:w="http://schemas.openxmlformats.org/wordprocessingml/2006/main" xmlns:w14="http://schemas.microsoft.com/office/word/2010/wordml" xmlns:w15="http://schemas.microsoft.com/office/word/2012/wordml" xmlns:w16cei="http://schemas.microsoft.com/office/word/2026/wordml/cei" xmlns:w16cex="http://schemas.microsoft.com/office/word/2018/wordml/cex" xmlns:w16cid="http://schemas.microsoft.com/office/word/2016/wordml/cid" xmlns:w16="http://schemas.microsoft.com/office/word/2018/wordml" xmlns:w16du="http://schemas.microsoft.com/office/word/2023/wordml/word16du" xmlns:w16sdtdh="http://schemas.microsoft.com/office/word/2020/wordml/sdtdatahash" xmlns:w16sdtfl="http://schemas.microsoft.com/office/word/2024/wordml/sdtformatlock" xmlns:w16se="http://schemas.microsoft.com/office/word/2015/wordml/symex" xmlns:wpg="http://schemas.microsoft.com/office/word/2010/wordprocessingGroup" xmlns:wpi="http://schemas.microsoft.com/office/word/2010/wordprocessingInk" xmlns:wne="http://schemas.microsoft.com/office/word/2006/wordml" xmlns:wps="http://schemas.microsoft.com/office/word/2010/wordprocessingShape" mc:Ignorable="w14 w15 w16se w16cid w16 w16cex w16sdtdh w16sdtfl w16du wp14">
+<w:endnotes xmlns:wpc="http://schemas.microsoft.com/office/word/2010/wordprocessingCanvas" xmlns:cx="http://schemas.microsoft.com/office/drawing/2014/chartex" xmlns:cx1="http://schemas.microsoft.com/office/drawing/2015/9/8/chartex" xmlns:cx2="http://schemas.microsoft.com/office/drawing/2015/10/21/chartex" xmlns:cx3="http://schemas.microsoft.com/office/drawing/2016/5/9/chartex" xmlns:cx4="http://schemas.microsoft.com/office/drawing/2016/5/10/chartex" xmlns:cx5="http://schemas.microsoft.com/office/drawing/2016/5/11/chartex" xmlns:cx6="http://schemas.microsoft.com/office/drawing/2016/5/12/chartex" xmlns:cx7="http://schemas.microsoft.com/office/drawing/2016/5/13/chartex" xmlns:cx8="http://schemas.microsoft.com/office/drawing/2016/5/14/chartex" xmlns:mc="http://schemas.openxmlformats.org/markup-compatibility/2006" xmlns:aink="http://schemas.microsoft.com/office/drawing/2016/ink" xmlns:am3d="http://schemas.microsoft.com/office/drawing/2017/model3d" xmlns:o="urn:schemas-microsoft-com:office:office" xmlns:oel="http://schemas.microsoft.com/office/2019/extlst" xmlns:r="http://schemas.openxmlformats.org/officeDocument/2006/relationships" xmlns:m="http://schemas.openxmlformats.org/officeDocument/2006/math" xmlns:v="urn:schemas-microsoft-com:vml" xmlns:wp14="http://schemas.microsoft.com/office/word/2010/wordprocessingDrawing" xmlns:wp="http://schemas.openxmlformats.org/drawingml/2006/wordprocessingDrawing" xmlns:w10="urn:schemas-microsoft-com:office:word" xmlns:w="http://schemas.openxmlformats.org/wordprocessingml/2006/main" xmlns:w14="http://schemas.microsoft.com/office/word/2010/wordml" xmlns:w15="http://schemas.microsoft.com/office/word/2012/wordml" xmlns:w16cex="http://schemas.microsoft.com/office/word/2018/wordml/cex" xmlns:w16cid="http://schemas.microsoft.com/office/word/2016/wordml/cid" xmlns:w16="http://schemas.microsoft.com/office/word/2018/wordml" xmlns:w16du="http://schemas.microsoft.com/office/word/2023/wordml/word16du" xmlns:w16sdtdh="http://schemas.microsoft.com/office/word/2020/wordml/sdtdatahash" xmlns:w16sdtfl="http://schemas.microsoft.com/office/word/2024/wordml/sdtformatlock" xmlns:w16se="http://schemas.microsoft.com/office/word/2015/wordml/symex" xmlns:wpg="http://schemas.microsoft.com/office/word/2010/wordprocessingGroup" xmlns:wpi="http://schemas.microsoft.com/office/word/2010/wordprocessingInk" xmlns:wne="http://schemas.microsoft.com/office/word/2006/wordml" xmlns:wps="http://schemas.microsoft.com/office/word/2010/wordprocessingShape" mc:Ignorable="w14 w15 w16se w16cid w16 w16cex w16sdtdh w16sdtfl w16du wp14">
   <w:endnote w:type="separator" w:id="-1">
     <w:p>
       <w:r>
@@ -1973,7 +2021,7 @@
 </file>
 
 <file path=word/footer1.xml><?xml version="1.0" encoding="utf-8"?>
-<w:ftr xmlns:wpc="http://schemas.microsoft.com/office/word/2010/wordprocessingCanvas" xmlns:cx="http://schemas.microsoft.com/office/drawing/2014/chartex" xmlns:cx1="http://schemas.microsoft.com/office/drawing/2015/9/8/chartex" xmlns:cx2="http://schemas.microsoft.com/office/drawing/2015/10/21/chartex" xmlns:cx3="http://schemas.microsoft.com/office/drawing/2016/5/9/chartex" xmlns:cx4="http://schemas.microsoft.com/office/drawing/2016/5/10/chartex" xmlns:cx5="http://schemas.microsoft.com/office/drawing/2016/5/11/chartex" xmlns:cx6="http://schemas.microsoft.com/office/drawing/2016/5/12/chartex" xmlns:cx7="http://schemas.microsoft.com/office/drawing/2016/5/13/chartex" xmlns:cx8="http://schemas.microsoft.com/office/drawing/2016/5/14/chartex" xmlns:mc="http://schemas.openxmlformats.org/markup-compatibility/2006" xmlns:aink="http://schemas.microsoft.com/office/drawing/2016/ink" xmlns:am3d="http://schemas.microsoft.com/office/drawing/2017/model3d" xmlns:o="urn:schemas-microsoft-com:office:office" xmlns:oel="http://schemas.microsoft.com/office/2019/extlst" xmlns:r="http://schemas.openxmlformats.org/officeDocument/2006/relationships" xmlns:m="http://schemas.openxmlformats.org/officeDocument/2006/math" xmlns:v="urn:schemas-microsoft-com:vml" xmlns:wp14="http://schemas.microsoft.com/office/word/2010/wordprocessingDrawing" xmlns:wp="http://schemas.openxmlformats.org/drawingml/2006/wordprocessingDrawing" xmlns:w10="urn:schemas-microsoft-com:office:word" xmlns:w="http://schemas.openxmlformats.org/wordprocessingml/2006/main" xmlns:w14="http://schemas.microsoft.com/office/word/2010/wordml" xmlns:w15="http://schemas.microsoft.com/office/word/2012/wordml" xmlns:w16cei="http://schemas.microsoft.com/office/word/2026/wordml/cei" xmlns:w16cex="http://schemas.microsoft.com/office/word/2018/wordml/cex" xmlns:w16cid="http://schemas.microsoft.com/office/word/2016/wordml/cid" xmlns:w16="http://schemas.microsoft.com/office/word/2018/wordml" xmlns:w16du="http://schemas.microsoft.com/office/word/2023/wordml/word16du" xmlns:w16sdtdh="http://schemas.microsoft.com/office/word/2020/wordml/sdtdatahash" xmlns:w16sdtfl="http://schemas.microsoft.com/office/word/2024/wordml/sdtformatlock" xmlns:w16se="http://schemas.microsoft.com/office/word/2015/wordml/symex" xmlns:wpg="http://schemas.microsoft.com/office/word/2010/wordprocessingGroup" xmlns:wpi="http://schemas.microsoft.com/office/word/2010/wordprocessingInk" xmlns:wne="http://schemas.microsoft.com/office/word/2006/wordml" xmlns:wps="http://schemas.microsoft.com/office/word/2010/wordprocessingShape" mc:Ignorable="w14 w15 w16se w16cid w16 w16cex w16sdtdh w16sdtfl w16du wp14">
+<w:ftr xmlns:wpc="http://schemas.microsoft.com/office/word/2010/wordprocessingCanvas" xmlns:cx="http://schemas.microsoft.com/office/drawing/2014/chartex" xmlns:cx1="http://schemas.microsoft.com/office/drawing/2015/9/8/chartex" xmlns:cx2="http://schemas.microsoft.com/office/drawing/2015/10/21/chartex" xmlns:cx3="http://schemas.microsoft.com/office/drawing/2016/5/9/chartex" xmlns:cx4="http://schemas.microsoft.com/office/drawing/2016/5/10/chartex" xmlns:cx5="http://schemas.microsoft.com/office/drawing/2016/5/11/chartex" xmlns:cx6="http://schemas.microsoft.com/office/drawing/2016/5/12/chartex" xmlns:cx7="http://schemas.microsoft.com/office/drawing/2016/5/13/chartex" xmlns:cx8="http://schemas.microsoft.com/office/drawing/2016/5/14/chartex" xmlns:mc="http://schemas.openxmlformats.org/markup-compatibility/2006" xmlns:aink="http://schemas.microsoft.com/office/drawing/2016/ink" xmlns:am3d="http://schemas.microsoft.com/office/drawing/2017/model3d" xmlns:o="urn:schemas-microsoft-com:office:office" xmlns:oel="http://schemas.microsoft.com/office/2019/extlst" xmlns:r="http://schemas.openxmlformats.org/officeDocument/2006/relationships" xmlns:m="http://schemas.openxmlformats.org/officeDocument/2006/math" xmlns:v="urn:schemas-microsoft-com:vml" xmlns:wp14="http://schemas.microsoft.com/office/word/2010/wordprocessingDrawing" xmlns:wp="http://schemas.openxmlformats.org/drawingml/2006/wordprocessingDrawing" xmlns:w10="urn:schemas-microsoft-com:office:word" xmlns:w="http://schemas.openxmlformats.org/wordprocessingml/2006/main" xmlns:w14="http://schemas.microsoft.com/office/word/2010/wordml" xmlns:w15="http://schemas.microsoft.com/office/word/2012/wordml" xmlns:w16cex="http://schemas.microsoft.com/office/word/2018/wordml/cex" xmlns:w16cid="http://schemas.microsoft.com/office/word/2016/wordml/cid" xmlns:w16="http://schemas.microsoft.com/office/word/2018/wordml" xmlns:w16du="http://schemas.microsoft.com/office/word/2023/wordml/word16du" xmlns:w16sdtdh="http://schemas.microsoft.com/office/word/2020/wordml/sdtdatahash" xmlns:w16sdtfl="http://schemas.microsoft.com/office/word/2024/wordml/sdtformatlock" xmlns:w16se="http://schemas.microsoft.com/office/word/2015/wordml/symex" xmlns:wpg="http://schemas.microsoft.com/office/word/2010/wordprocessingGroup" xmlns:wpi="http://schemas.microsoft.com/office/word/2010/wordprocessingInk" xmlns:wne="http://schemas.microsoft.com/office/word/2006/wordml" xmlns:wps="http://schemas.microsoft.com/office/word/2010/wordprocessingShape" mc:Ignorable="w14 w15 w16se w16cid w16 w16cex w16sdtdh w16sdtfl w16du wp14">
   <w:p>
     <w:pPr>
       <w:spacing w:before="40" w:after="20"/>
@@ -2052,7 +2100,7 @@
 </file>
 
 <file path=word/footnotes.xml><?xml version="1.0" encoding="utf-8"?>
-<w:footnotes xmlns:wpc="http://schemas.microsoft.com/office/word/2010/wordprocessingCanvas" xmlns:cx="http://schemas.microsoft.com/office/drawing/2014/chartex" xmlns:cx1="http://schemas.microsoft.com/office/drawing/2015/9/8/chartex" xmlns:cx2="http://schemas.microsoft.com/office/drawing/2015/10/21/chartex" xmlns:cx3="http://schemas.microsoft.com/office/drawing/2016/5/9/chartex" xmlns:cx4="http://schemas.microsoft.com/office/drawing/2016/5/10/chartex" xmlns:cx5="http://schemas.microsoft.com/office/drawing/2016/5/11/chartex" xmlns:cx6="http://schemas.microsoft.com/office/drawing/2016/5/12/chartex" xmlns:cx7="http://schemas.microsoft.com/office/drawing/2016/5/13/chartex" xmlns:cx8="http://schemas.microsoft.com/office/drawing/2016/5/14/chartex" xmlns:mc="http://schemas.openxmlformats.org/markup-compatibility/2006" xmlns:aink="http://schemas.microsoft.com/office/drawing/2016/ink" xmlns:am3d="http://schemas.microsoft.com/office/drawing/2017/model3d" xmlns:o="urn:schemas-microsoft-com:office:office" xmlns:oel="http://schemas.microsoft.com/office/2019/extlst" xmlns:r="http://schemas.openxmlformats.org/officeDocument/2006/relationships" xmlns:m="http://schemas.openxmlformats.org/officeDocument/2006/math" xmlns:v="urn:schemas-microsoft-com:vml" xmlns:wp14="http://schemas.microsoft.com/office/word/2010/wordprocessingDrawing" xmlns:wp="http://schemas.openxmlformats.org/drawingml/2006/wordprocessingDrawing" xmlns:w10="urn:schemas-microsoft-com:office:word" xmlns:w="http://schemas.openxmlformats.org/wordprocessingml/2006/main" xmlns:w14="http://schemas.microsoft.com/office/word/2010/wordml" xmlns:w15="http://schemas.microsoft.com/office/word/2012/wordml" xmlns:w16cei="http://schemas.microsoft.com/office/word/2026/wordml/cei" xmlns:w16cex="http://schemas.microsoft.com/office/word/2018/wordml/cex" xmlns:w16cid="http://schemas.microsoft.com/office/word/2016/wordml/cid" xmlns:w16="http://schemas.microsoft.com/office/word/2018/wordml" xmlns:w16du="http://schemas.microsoft.com/office/word/2023/wordml/word16du" xmlns:w16sdtdh="http://schemas.microsoft.com/office/word/2020/wordml/sdtdatahash" xmlns:w16sdtfl="http://schemas.microsoft.com/office/word/2024/wordml/sdtformatlock" xmlns:w16se="http://schemas.microsoft.com/office/word/2015/wordml/symex" xmlns:wpg="http://schemas.microsoft.com/office/word/2010/wordprocessingGroup" xmlns:wpi="http://schemas.microsoft.com/office/word/2010/wordprocessingInk" xmlns:wne="http://schemas.microsoft.com/office/word/2006/wordml" xmlns:wps="http://schemas.microsoft.com/office/word/2010/wordprocessingShape" mc:Ignorable="w14 w15 w16se w16cid w16 w16cex w16sdtdh w16sdtfl w16du wp14">
+<w:footnotes xmlns:wpc="http://schemas.microsoft.com/office/word/2010/wordprocessingCanvas" xmlns:cx="http://schemas.microsoft.com/office/drawing/2014/chartex" xmlns:cx1="http://schemas.microsoft.com/office/drawing/2015/9/8/chartex" xmlns:cx2="http://schemas.microsoft.com/office/drawing/2015/10/21/chartex" xmlns:cx3="http://schemas.microsoft.com/office/drawing/2016/5/9/chartex" xmlns:cx4="http://schemas.microsoft.com/office/drawing/2016/5/10/chartex" xmlns:cx5="http://schemas.microsoft.com/office/drawing/2016/5/11/chartex" xmlns:cx6="http://schemas.microsoft.com/office/drawing/2016/5/12/chartex" xmlns:cx7="http://schemas.microsoft.com/office/drawing/2016/5/13/chartex" xmlns:cx8="http://schemas.microsoft.com/office/drawing/2016/5/14/chartex" xmlns:mc="http://schemas.openxmlformats.org/markup-compatibility/2006" xmlns:aink="http://schemas.microsoft.com/office/drawing/2016/ink" xmlns:am3d="http://schemas.microsoft.com/office/drawing/2017/model3d" xmlns:o="urn:schemas-microsoft-com:office:office" xmlns:oel="http://schemas.microsoft.com/office/2019/extlst" xmlns:r="http://schemas.openxmlformats.org/officeDocument/2006/relationships" xmlns:m="http://schemas.openxmlformats.org/officeDocument/2006/math" xmlns:v="urn:schemas-microsoft-com:vml" xmlns:wp14="http://schemas.microsoft.com/office/word/2010/wordprocessingDrawing" xmlns:wp="http://schemas.openxmlformats.org/drawingml/2006/wordprocessingDrawing" xmlns:w10="urn:schemas-microsoft-com:office:word" xmlns:w="http://schemas.openxmlformats.org/wordprocessingml/2006/main" xmlns:w14="http://schemas.microsoft.com/office/word/2010/wordml" xmlns:w15="http://schemas.microsoft.com/office/word/2012/wordml" xmlns:w16cex="http://schemas.microsoft.com/office/word/2018/wordml/cex" xmlns:w16cid="http://schemas.microsoft.com/office/word/2016/wordml/cid" xmlns:w16="http://schemas.microsoft.com/office/word/2018/wordml" xmlns:w16du="http://schemas.microsoft.com/office/word/2023/wordml/word16du" xmlns:w16sdtdh="http://schemas.microsoft.com/office/word/2020/wordml/sdtdatahash" xmlns:w16sdtfl="http://schemas.microsoft.com/office/word/2024/wordml/sdtformatlock" xmlns:w16se="http://schemas.microsoft.com/office/word/2015/wordml/symex" xmlns:wpg="http://schemas.microsoft.com/office/word/2010/wordprocessingGroup" xmlns:wpi="http://schemas.microsoft.com/office/word/2010/wordprocessingInk" xmlns:wne="http://schemas.microsoft.com/office/word/2006/wordml" xmlns:wps="http://schemas.microsoft.com/office/word/2010/wordprocessingShape" mc:Ignorable="w14 w15 w16se w16cid w16 w16cex w16sdtdh w16sdtfl w16du wp14">
   <w:footnote w:type="separator" w:id="-1">
     <w:p>
       <w:r>
@@ -2071,7 +2119,7 @@
 </file>
 
 <file path=word/header1.xml><?xml version="1.0" encoding="utf-8"?>
-<w:hdr xmlns:wpc="http://schemas.microsoft.com/office/word/2010/wordprocessingCanvas" xmlns:cx="http://schemas.microsoft.com/office/drawing/2014/chartex" xmlns:cx1="http://schemas.microsoft.com/office/drawing/2015/9/8/chartex" xmlns:cx2="http://schemas.microsoft.com/office/drawing/2015/10/21/chartex" xmlns:cx3="http://schemas.microsoft.com/office/drawing/2016/5/9/chartex" xmlns:cx4="http://schemas.microsoft.com/office/drawing/2016/5/10/chartex" xmlns:cx5="http://schemas.microsoft.com/office/drawing/2016/5/11/chartex" xmlns:cx6="http://schemas.microsoft.com/office/drawing/2016/5/12/chartex" xmlns:cx7="http://schemas.microsoft.com/office/drawing/2016/5/13/chartex" xmlns:cx8="http://schemas.microsoft.com/office/drawing/2016/5/14/chartex" xmlns:mc="http://schemas.openxmlformats.org/markup-compatibility/2006" xmlns:aink="http://schemas.microsoft.com/office/drawing/2016/ink" xmlns:am3d="http://schemas.microsoft.com/office/drawing/2017/model3d" xmlns:o="urn:schemas-microsoft-com:office:office" xmlns:oel="http://schemas.microsoft.com/office/2019/extlst" xmlns:r="http://schemas.openxmlformats.org/officeDocument/2006/relationships" xmlns:m="http://schemas.openxmlformats.org/officeDocument/2006/math" xmlns:v="urn:schemas-microsoft-com:vml" xmlns:wp14="http://schemas.microsoft.com/office/word/2010/wordprocessingDrawing" xmlns:wp="http://schemas.openxmlformats.org/drawingml/2006/wordprocessingDrawing" xmlns:w10="urn:schemas-microsoft-com:office:word" xmlns:w="http://schemas.openxmlformats.org/wordprocessingml/2006/main" xmlns:w14="http://schemas.microsoft.com/office/word/2010/wordml" xmlns:w15="http://schemas.microsoft.com/office/word/2012/wordml" xmlns:w16cei="http://schemas.microsoft.com/office/word/2026/wordml/cei" xmlns:w16cex="http://schemas.microsoft.com/office/word/2018/wordml/cex" xmlns:w16cid="http://schemas.microsoft.com/office/word/2016/wordml/cid" xmlns:w16="http://schemas.microsoft.com/office/word/2018/wordml" xmlns:w16du="http://schemas.microsoft.com/office/word/2023/wordml/word16du" xmlns:w16sdtdh="http://schemas.microsoft.com/office/word/2020/wordml/sdtdatahash" xmlns:w16sdtfl="http://schemas.microsoft.com/office/word/2024/wordml/sdtformatlock" xmlns:w16se="http://schemas.microsoft.com/office/word/2015/wordml/symex" xmlns:wpg="http://schemas.microsoft.com/office/word/2010/wordprocessingGroup" xmlns:wpi="http://schemas.microsoft.com/office/word/2010/wordprocessingInk" xmlns:wne="http://schemas.microsoft.com/office/word/2006/wordml" xmlns:wps="http://schemas.microsoft.com/office/word/2010/wordprocessingShape" mc:Ignorable="w14 w15 w16se w16cid w16 w16cex w16sdtdh w16sdtfl w16du wp14">
+<w:hdr xmlns:wpc="http://schemas.microsoft.com/office/word/2010/wordprocessingCanvas" xmlns:cx="http://schemas.microsoft.com/office/drawing/2014/chartex" xmlns:cx1="http://schemas.microsoft.com/office/drawing/2015/9/8/chartex" xmlns:cx2="http://schemas.microsoft.com/office/drawing/2015/10/21/chartex" xmlns:cx3="http://schemas.microsoft.com/office/drawing/2016/5/9/chartex" xmlns:cx4="http://schemas.microsoft.com/office/drawing/2016/5/10/chartex" xmlns:cx5="http://schemas.microsoft.com/office/drawing/2016/5/11/chartex" xmlns:cx6="http://schemas.microsoft.com/office/drawing/2016/5/12/chartex" xmlns:cx7="http://schemas.microsoft.com/office/drawing/2016/5/13/chartex" xmlns:cx8="http://schemas.microsoft.com/office/drawing/2016/5/14/chartex" xmlns:mc="http://schemas.openxmlformats.org/markup-compatibility/2006" xmlns:aink="http://schemas.microsoft.com/office/drawing/2016/ink" xmlns:am3d="http://schemas.microsoft.com/office/drawing/2017/model3d" xmlns:o="urn:schemas-microsoft-com:office:office" xmlns:oel="http://schemas.microsoft.com/office/2019/extlst" xmlns:r="http://schemas.openxmlformats.org/officeDocument/2006/relationships" xmlns:m="http://schemas.openxmlformats.org/officeDocument/2006/math" xmlns:v="urn:schemas-microsoft-com:vml" xmlns:wp14="http://schemas.microsoft.com/office/word/2010/wordprocessingDrawing" xmlns:wp="http://schemas.openxmlformats.org/drawingml/2006/wordprocessingDrawing" xmlns:w10="urn:schemas-microsoft-com:office:word" xmlns:w="http://schemas.openxmlformats.org/wordprocessingml/2006/main" xmlns:w14="http://schemas.microsoft.com/office/word/2010/wordml" xmlns:w15="http://schemas.microsoft.com/office/word/2012/wordml" xmlns:w16cex="http://schemas.microsoft.com/office/word/2018/wordml/cex" xmlns:w16cid="http://schemas.microsoft.com/office/word/2016/wordml/cid" xmlns:w16="http://schemas.microsoft.com/office/word/2018/wordml" xmlns:w16du="http://schemas.microsoft.com/office/word/2023/wordml/word16du" xmlns:w16sdtdh="http://schemas.microsoft.com/office/word/2020/wordml/sdtdatahash" xmlns:w16sdtfl="http://schemas.microsoft.com/office/word/2024/wordml/sdtformatlock" xmlns:w16se="http://schemas.microsoft.com/office/word/2015/wordml/symex" xmlns:wpg="http://schemas.microsoft.com/office/word/2010/wordprocessingGroup" xmlns:wpi="http://schemas.microsoft.com/office/word/2010/wordprocessingInk" xmlns:wne="http://schemas.microsoft.com/office/word/2006/wordml" xmlns:wps="http://schemas.microsoft.com/office/word/2010/wordprocessingShape" mc:Ignorable="w14 w15 w16se w16cid w16 w16cex w16sdtdh w16sdtfl w16du wp14">
   <w:p>
     <w:pPr>
       <w:spacing w:before="160" w:after="40"/>
@@ -2297,7 +2345,7 @@
 </file>
 
 <file path=word/numbering.xml><?xml version="1.0" encoding="utf-8"?>
-<w:numbering xmlns:wpc="http://schemas.microsoft.com/office/word/2010/wordprocessingCanvas" xmlns:cx="http://schemas.microsoft.com/office/drawing/2014/chartex" xmlns:cx1="http://schemas.microsoft.com/office/drawing/2015/9/8/chartex" xmlns:cx2="http://schemas.microsoft.com/office/drawing/2015/10/21/chartex" xmlns:cx3="http://schemas.microsoft.com/office/drawing/2016/5/9/chartex" xmlns:cx4="http://schemas.microsoft.com/office/drawing/2016/5/10/chartex" xmlns:cx5="http://schemas.microsoft.com/office/drawing/2016/5/11/chartex" xmlns:cx6="http://schemas.microsoft.com/office/drawing/2016/5/12/chartex" xmlns:cx7="http://schemas.microsoft.com/office/drawing/2016/5/13/chartex" xmlns:cx8="http://schemas.microsoft.com/office/drawing/2016/5/14/chartex" xmlns:mc="http://schemas.openxmlformats.org/markup-compatibility/2006" xmlns:aink="http://schemas.microsoft.com/office/drawing/2016/ink" xmlns:am3d="http://schemas.microsoft.com/office/drawing/2017/model3d" xmlns:o="urn:schemas-microsoft-com:office:office" xmlns:oel="http://schemas.microsoft.com/office/2019/extlst" xmlns:r="http://schemas.openxmlformats.org/officeDocument/2006/relationships" xmlns:m="http://schemas.openxmlformats.org/officeDocument/2006/math" xmlns:v="urn:schemas-microsoft-com:vml" xmlns:wp14="http://schemas.microsoft.com/office/word/2010/wordprocessingDrawing" xmlns:wp="http://schemas.openxmlformats.org/drawingml/2006/wordprocessingDrawing" xmlns:w10="urn:schemas-microsoft-com:office:word" xmlns:w="http://schemas.openxmlformats.org/wordprocessingml/2006/main" xmlns:w14="http://schemas.microsoft.com/office/word/2010/wordml" xmlns:w15="http://schemas.microsoft.com/office/word/2012/wordml" xmlns:w16cei="http://schemas.microsoft.com/office/word/2026/wordml/cei" xmlns:w16cex="http://schemas.microsoft.com/office/word/2018/wordml/cex" xmlns:w16cid="http://schemas.microsoft.com/office/word/2016/wordml/cid" xmlns:w16="http://schemas.microsoft.com/office/word/2018/wordml" xmlns:w16du="http://schemas.microsoft.com/office/word/2023/wordml/word16du" xmlns:w16sdtdh="http://schemas.microsoft.com/office/word/2020/wordml/sdtdatahash" xmlns:w16sdtfl="http://schemas.microsoft.com/office/word/2024/wordml/sdtformatlock" xmlns:w16se="http://schemas.microsoft.com/office/word/2015/wordml/symex" xmlns:wpg="http://schemas.microsoft.com/office/word/2010/wordprocessingGroup" xmlns:wpi="http://schemas.microsoft.com/office/word/2010/wordprocessingInk" xmlns:wne="http://schemas.microsoft.com/office/word/2006/wordml" xmlns:wps="http://schemas.microsoft.com/office/word/2010/wordprocessingShape" mc:Ignorable="w14 w15 w16se w16cid w16 w16cex w16sdtdh w16sdtfl w16du wp14">
+<w:numbering xmlns:wpc="http://schemas.microsoft.com/office/word/2010/wordprocessingCanvas" xmlns:cx="http://schemas.microsoft.com/office/drawing/2014/chartex" xmlns:cx1="http://schemas.microsoft.com/office/drawing/2015/9/8/chartex" xmlns:cx2="http://schemas.microsoft.com/office/drawing/2015/10/21/chartex" xmlns:cx3="http://schemas.microsoft.com/office/drawing/2016/5/9/chartex" xmlns:cx4="http://schemas.microsoft.com/office/drawing/2016/5/10/chartex" xmlns:cx5="http://schemas.microsoft.com/office/drawing/2016/5/11/chartex" xmlns:cx6="http://schemas.microsoft.com/office/drawing/2016/5/12/chartex" xmlns:cx7="http://schemas.microsoft.com/office/drawing/2016/5/13/chartex" xmlns:cx8="http://schemas.microsoft.com/office/drawing/2016/5/14/chartex" xmlns:mc="http://schemas.openxmlformats.org/markup-compatibility/2006" xmlns:aink="http://schemas.microsoft.com/office/drawing/2016/ink" xmlns:am3d="http://schemas.microsoft.com/office/drawing/2017/model3d" xmlns:o="urn:schemas-microsoft-com:office:office" xmlns:oel="http://schemas.microsoft.com/office/2019/extlst" xmlns:r="http://schemas.openxmlformats.org/officeDocument/2006/relationships" xmlns:m="http://schemas.openxmlformats.org/officeDocument/2006/math" xmlns:v="urn:schemas-microsoft-com:vml" xmlns:wp14="http://schemas.microsoft.com/office/word/2010/wordprocessingDrawing" xmlns:wp="http://schemas.openxmlformats.org/drawingml/2006/wordprocessingDrawing" xmlns:w10="urn:schemas-microsoft-com:office:word" xmlns:w="http://schemas.openxmlformats.org/wordprocessingml/2006/main" xmlns:w14="http://schemas.microsoft.com/office/word/2010/wordml" xmlns:w15="http://schemas.microsoft.com/office/word/2012/wordml" xmlns:w16cex="http://schemas.microsoft.com/office/word/2018/wordml/cex" xmlns:w16cid="http://schemas.microsoft.com/office/word/2016/wordml/cid" xmlns:w16="http://schemas.microsoft.com/office/word/2018/wordml" xmlns:w16du="http://schemas.microsoft.com/office/word/2023/wordml/word16du" xmlns:w16sdtdh="http://schemas.microsoft.com/office/word/2020/wordml/sdtdatahash" xmlns:w16sdtfl="http://schemas.microsoft.com/office/word/2024/wordml/sdtformatlock" xmlns:w16se="http://schemas.microsoft.com/office/word/2015/wordml/symex" xmlns:wpg="http://schemas.microsoft.com/office/word/2010/wordprocessingGroup" xmlns:wpi="http://schemas.microsoft.com/office/word/2010/wordprocessingInk" xmlns:wne="http://schemas.microsoft.com/office/word/2006/wordml" xmlns:wps="http://schemas.microsoft.com/office/word/2010/wordprocessingShape" mc:Ignorable="w14 w15 w16se w16cid w16 w16cex w16sdtdh w16sdtfl w16du wp14">
   <w:abstractNum w:abstractNumId="0" w15:restartNumberingAfterBreak="0">
     <w:nsid w:val="1A684F2A"/>
     <w:multiLevelType w:val="hybridMultilevel"/>

</xml_diff>

<commit_message>
Consent form now clarifies that organizations run no risks, and early anomymization is mentioned explicitly
</commit_message>
<xml_diff>
--- a/World Cafe Facilitation Guide/Informed Consent Form.docx
+++ b/World Cafe Facilitation Guide/Informed Consent Form.docx
@@ -127,7 +127,31 @@
               <w:rPr>
                 <w:lang w:val="en-US"/>
               </w:rPr>
-              <w:t>Help us uncover how organizations can use AI effectively, responsibly and human-centered.</w:t>
+              <w:t>Help us uncover how organizations can use AI</w:t>
+            </w:r>
+            <w:r>
+              <w:rPr>
+                <w:lang w:val="en-US"/>
+              </w:rPr>
+              <w:t xml:space="preserve"> in a </w:t>
+            </w:r>
+            <w:r>
+              <w:rPr>
+                <w:lang w:val="en-US"/>
+              </w:rPr>
+              <w:t>human-centered</w:t>
+            </w:r>
+            <w:r>
+              <w:rPr>
+                <w:lang w:val="en-US"/>
+              </w:rPr>
+              <w:t xml:space="preserve"> manner</w:t>
+            </w:r>
+            <w:r>
+              <w:rPr>
+                <w:lang w:val="en-US"/>
+              </w:rPr>
+              <w:t>.</w:t>
             </w:r>
           </w:p>
         </w:tc>
@@ -318,7 +342,25 @@
               <w:rPr>
                 <w:lang w:val="en-US"/>
               </w:rPr>
-              <w:t>The session is facilitated by someone in your organization.</w:t>
+              <w:t xml:space="preserve">The session is facilitated by </w:t>
+            </w:r>
+            <w:r>
+              <w:rPr>
+                <w:lang w:val="en-US"/>
+              </w:rPr>
+              <w:t xml:space="preserve">a </w:t>
+            </w:r>
+            <w:r>
+              <w:rPr>
+                <w:lang w:val="en-US"/>
+              </w:rPr>
+              <w:t xml:space="preserve">trained </w:t>
+            </w:r>
+            <w:r>
+              <w:rPr>
+                <w:lang w:val="en-US"/>
+              </w:rPr>
+              <w:t>facilitator.</w:t>
             </w:r>
           </w:p>
           <w:p>
@@ -336,7 +378,31 @@
               <w:rPr>
                 <w:lang w:val="en-US"/>
               </w:rPr>
-              <w:t>Written outputs are shared with the research initiative for analysis.</w:t>
+              <w:t>Written outputs</w:t>
+            </w:r>
+            <w:r>
+              <w:rPr>
+                <w:lang w:val="en-US"/>
+              </w:rPr>
+              <w:t xml:space="preserve"> are anonymized </w:t>
+            </w:r>
+            <w:r>
+              <w:rPr>
+                <w:lang w:val="en-US"/>
+              </w:rPr>
+              <w:t xml:space="preserve">and scrubbed of business-sensitive information </w:t>
+            </w:r>
+            <w:r>
+              <w:rPr>
+                <w:lang w:val="en-US"/>
+              </w:rPr>
+              <w:t>by the facilitator and then</w:t>
+            </w:r>
+            <w:r>
+              <w:rPr>
+                <w:lang w:val="en-US"/>
+              </w:rPr>
+              <w:t xml:space="preserve"> shared with the research initiative for analysis.</w:t>
             </w:r>
           </w:p>
           <w:p>
@@ -440,7 +506,16 @@
               </w:numPr>
             </w:pPr>
             <w:r>
-              <w:t>There are no risks to you.</w:t>
+              <w:t>There are no risks to you</w:t>
+            </w:r>
+            <w:r>
+              <w:rPr>
+                <w:lang w:val="en-US"/>
+              </w:rPr>
+              <w:t xml:space="preserve"> or your organization</w:t>
+            </w:r>
+            <w:r>
+              <w:t>.</w:t>
             </w:r>
           </w:p>
           <w:p>
@@ -562,7 +637,7 @@
               </w:numPr>
             </w:pPr>
             <w:r>
-              <w:t>Ask questions about the research at any time before, during, or after your participation.</w:t>
+              <w:t>Ask questions about the research at any time before, or after your participation.</w:t>
             </w:r>
           </w:p>
           <w:p>
@@ -574,7 +649,16 @@
               </w:numPr>
             </w:pPr>
             <w:r>
-              <w:t>Receive a summary of the research findings upon request.</w:t>
+              <w:t>Receive a summary of the research findings</w:t>
+            </w:r>
+            <w:r>
+              <w:t xml:space="preserve"> </w:t>
+            </w:r>
+            <w:r>
+              <w:rPr>
+                <w:lang w:val="en-US"/>
+              </w:rPr>
+              <w:t>on request.</w:t>
             </w:r>
           </w:p>
           <w:p>

</xml_diff>